<commit_message>
Add strict C89 port of the interpreter (c/), benchmarks (bench/), manual section
Co-Authored-By: Claude Sonnet 5.5 <noreply@anthropic.com>
Claude-Session: https://claude.ai/code/session_013PfZHD8os4FWhvmVG9Tf7M
</commit_message>
<xml_diff>
--- a/docs/BASIC-CREXX-Guide.docx
+++ b/docs/BASIC-CREXX-Guide.docx
@@ -367,7 +367,7 @@
           <w:sz w:val="18"/>
           <w:szCs w:val="18"/>
         </w:rPr>
-        <w:t xml:space="preserve">Command-line options	3</w:t>
+        <w:t xml:space="preserve">The C version	3</w:t>
       </w:r>
     </w:p>
     <w:p>
@@ -386,7 +386,7 @@
           <w:sz w:val="18"/>
           <w:szCs w:val="18"/>
         </w:rPr>
-        <w:t xml:space="preserve">Interactive mode	4</w:t>
+        <w:t xml:space="preserve">Command-line options	4</w:t>
       </w:r>
     </w:p>
     <w:p>
@@ -405,7 +405,7 @@
           <w:sz w:val="18"/>
           <w:szCs w:val="18"/>
         </w:rPr>
-        <w:t xml:space="preserve">Exit status	4</w:t>
+        <w:t xml:space="preserve">Interactive mode	4</w:t>
       </w:r>
     </w:p>
     <w:p>
@@ -424,7 +424,26 @@
           <w:sz w:val="18"/>
           <w:szCs w:val="18"/>
         </w:rPr>
-        <w:t xml:space="preserve">Testing	4</w:t>
+        <w:t xml:space="preserve">Exit status	5</w:t>
+      </w:r>
+    </w:p>
+    <w:p>
+      <w:pPr>
+        <w:tabs>
+          <w:tab w:val="right" w:pos="9638" w:leader="dot"/>
+        </w:tabs>
+        <w:spacing w:after="0" w:before="0"/>
+        <w:ind w:left="360"/>
+      </w:pPr>
+      <w:r>
+        <w:rPr>
+          <w:rFonts w:ascii="Arial" w:cs="Arial" w:eastAsia="Arial" w:hAnsi="Arial"/>
+          <w:b w:val="false"/>
+          <w:bCs w:val="false"/>
+          <w:sz w:val="18"/>
+          <w:szCs w:val="18"/>
+        </w:rPr>
+        <w:t xml:space="preserve">Testing	5</w:t>
       </w:r>
     </w:p>
     <w:p>
@@ -443,7 +462,7 @@
           <w:sz w:val="19"/>
           <w:szCs w:val="19"/>
         </w:rPr>
-        <w:t xml:space="preserve">Chapter 3. The BASIC Language	5</w:t>
+        <w:t xml:space="preserve">Chapter 3. The BASIC Language	6</w:t>
       </w:r>
     </w:p>
     <w:p>
@@ -462,7 +481,7 @@
           <w:sz w:val="18"/>
           <w:szCs w:val="18"/>
         </w:rPr>
-        <w:t xml:space="preserve">Program layout	5</w:t>
+        <w:t xml:space="preserve">Program layout	6</w:t>
       </w:r>
     </w:p>
     <w:p>
@@ -481,7 +500,7 @@
           <w:sz w:val="18"/>
           <w:szCs w:val="18"/>
         </w:rPr>
-        <w:t xml:space="preserve">Names and data types	5</w:t>
+        <w:t xml:space="preserve">Names and data types	6</w:t>
       </w:r>
     </w:p>
     <w:p>
@@ -500,7 +519,7 @@
           <w:sz w:val="18"/>
           <w:szCs w:val="18"/>
         </w:rPr>
-        <w:t xml:space="preserve">Constants	5</w:t>
+        <w:t xml:space="preserve">Constants	6</w:t>
       </w:r>
     </w:p>
     <w:p>
@@ -519,7 +538,7 @@
           <w:sz w:val="18"/>
           <w:szCs w:val="18"/>
         </w:rPr>
-        <w:t xml:space="preserve">Expressions and operators	5</w:t>
+        <w:t xml:space="preserve">Expressions and operators	6</w:t>
       </w:r>
     </w:p>
     <w:p>
@@ -538,7 +557,7 @@
           <w:sz w:val="18"/>
           <w:szCs w:val="18"/>
         </w:rPr>
-        <w:t xml:space="preserve">Arrays	6</w:t>
+        <w:t xml:space="preserve">Arrays	7</w:t>
       </w:r>
     </w:p>
     <w:p>
@@ -557,7 +576,7 @@
           <w:sz w:val="19"/>
           <w:szCs w:val="19"/>
         </w:rPr>
-        <w:t xml:space="preserve">Chapter 4. Statements	7</w:t>
+        <w:t xml:space="preserve">Chapter 4. Statements	8</w:t>
       </w:r>
     </w:p>
     <w:p>
@@ -576,7 +595,7 @@
           <w:sz w:val="18"/>
           <w:szCs w:val="18"/>
         </w:rPr>
-        <w:t xml:space="preserve">Assignment and declaration	7</w:t>
+        <w:t xml:space="preserve">Assignment and declaration	8</w:t>
       </w:r>
     </w:p>
     <w:p>
@@ -595,7 +614,7 @@
           <w:sz w:val="18"/>
           <w:szCs w:val="18"/>
         </w:rPr>
-        <w:t xml:space="preserve">Decisions and loops	7</w:t>
+        <w:t xml:space="preserve">Decisions and loops	8</w:t>
       </w:r>
     </w:p>
     <w:p>
@@ -614,7 +633,7 @@
           <w:sz w:val="18"/>
           <w:szCs w:val="18"/>
         </w:rPr>
-        <w:t xml:space="preserve">Data	8</w:t>
+        <w:t xml:space="preserve">Data	9</w:t>
       </w:r>
     </w:p>
     <w:p>
@@ -633,7 +652,7 @@
           <w:sz w:val="18"/>
           <w:szCs w:val="18"/>
         </w:rPr>
-        <w:t xml:space="preserve">Program control and environment	8</w:t>
+        <w:t xml:space="preserve">Program control and environment	9</w:t>
       </w:r>
     </w:p>
     <w:p>
@@ -652,7 +671,7 @@
           <w:sz w:val="19"/>
           <w:szCs w:val="19"/>
         </w:rPr>
-        <w:t xml:space="preserve">Chapter 5. Procedures and Functions	10</w:t>
+        <w:t xml:space="preserve">Chapter 5. Procedures and Functions	11</w:t>
       </w:r>
     </w:p>
     <w:p>
@@ -671,7 +690,7 @@
           <w:sz w:val="18"/>
           <w:szCs w:val="18"/>
         </w:rPr>
-        <w:t xml:space="preserve">SUB and FUNCTION	10</w:t>
+        <w:t xml:space="preserve">SUB and FUNCTION	11</w:t>
       </w:r>
     </w:p>
     <w:p>
@@ -690,7 +709,7 @@
           <w:sz w:val="18"/>
           <w:szCs w:val="18"/>
         </w:rPr>
-        <w:t xml:space="preserve">Parameters	10</w:t>
+        <w:t xml:space="preserve">Parameters	11</w:t>
       </w:r>
     </w:p>
     <w:p>
@@ -709,7 +728,7 @@
           <w:sz w:val="18"/>
           <w:szCs w:val="18"/>
         </w:rPr>
-        <w:t xml:space="preserve">Scope of variables	10</w:t>
+        <w:t xml:space="preserve">Scope of variables	11</w:t>
       </w:r>
     </w:p>
     <w:p>
@@ -728,7 +747,7 @@
           <w:sz w:val="18"/>
           <w:szCs w:val="18"/>
         </w:rPr>
-        <w:t xml:space="preserve">DEF FN	10</w:t>
+        <w:t xml:space="preserve">DEF FN	11</w:t>
       </w:r>
     </w:p>
     <w:p>
@@ -747,7 +766,7 @@
           <w:sz w:val="18"/>
           <w:szCs w:val="18"/>
         </w:rPr>
-        <w:t xml:space="preserve">GOSUB	11</w:t>
+        <w:t xml:space="preserve">GOSUB	12</w:t>
       </w:r>
     </w:p>
     <w:p>
@@ -766,7 +785,7 @@
           <w:sz w:val="18"/>
           <w:szCs w:val="18"/>
         </w:rPr>
-        <w:t xml:space="preserve">Names that duplicate built-in functions	11</w:t>
+        <w:t xml:space="preserve">Names that duplicate built-in functions	12</w:t>
       </w:r>
     </w:p>
     <w:p>
@@ -785,7 +804,7 @@
           <w:sz w:val="19"/>
           <w:szCs w:val="19"/>
         </w:rPr>
-        <w:t xml:space="preserve">Chapter 6. Input and Output	12</w:t>
+        <w:t xml:space="preserve">Chapter 6. Input and Output	13</w:t>
       </w:r>
     </w:p>
     <w:p>
@@ -804,7 +823,7 @@
           <w:sz w:val="18"/>
           <w:szCs w:val="18"/>
         </w:rPr>
-        <w:t xml:space="preserve">PRINT	12</w:t>
+        <w:t xml:space="preserve">PRINT	13</w:t>
       </w:r>
     </w:p>
     <w:p>
@@ -823,7 +842,7 @@
           <w:sz w:val="18"/>
           <w:szCs w:val="18"/>
         </w:rPr>
-        <w:t xml:space="preserve">PRINT USING	12</w:t>
+        <w:t xml:space="preserve">PRINT USING	13</w:t>
       </w:r>
     </w:p>
     <w:p>
@@ -842,7 +861,7 @@
           <w:sz w:val="18"/>
           <w:szCs w:val="18"/>
         </w:rPr>
-        <w:t xml:space="preserve">INPUT and LINE INPUT	13</w:t>
+        <w:t xml:space="preserve">INPUT and LINE INPUT	14</w:t>
       </w:r>
     </w:p>
     <w:p>
@@ -861,7 +880,7 @@
           <w:sz w:val="18"/>
           <w:szCs w:val="18"/>
         </w:rPr>
-        <w:t xml:space="preserve">Files	13</w:t>
+        <w:t xml:space="preserve">Files	14</w:t>
       </w:r>
     </w:p>
     <w:p>
@@ -880,7 +899,7 @@
           <w:sz w:val="18"/>
           <w:szCs w:val="18"/>
         </w:rPr>
-        <w:t xml:space="preserve">Reading the keyboard directly	14</w:t>
+        <w:t xml:space="preserve">Reading the keyboard directly	15</w:t>
       </w:r>
     </w:p>
     <w:p>
@@ -899,7 +918,7 @@
           <w:sz w:val="19"/>
           <w:szCs w:val="19"/>
         </w:rPr>
-        <w:t xml:space="preserve">Chapter 7. Built-in Functions	15</w:t>
+        <w:t xml:space="preserve">Chapter 7. Built-in Functions	16</w:t>
       </w:r>
     </w:p>
     <w:p>
@@ -918,7 +937,7 @@
           <w:sz w:val="18"/>
           <w:szCs w:val="18"/>
         </w:rPr>
-        <w:t xml:space="preserve">Numeric functions	15</w:t>
+        <w:t xml:space="preserve">Numeric functions	16</w:t>
       </w:r>
     </w:p>
     <w:p>
@@ -937,7 +956,7 @@
           <w:sz w:val="18"/>
           <w:szCs w:val="18"/>
         </w:rPr>
-        <w:t xml:space="preserve">String functions	15</w:t>
+        <w:t xml:space="preserve">String functions	16</w:t>
       </w:r>
     </w:p>
     <w:p>
@@ -956,7 +975,7 @@
           <w:sz w:val="18"/>
           <w:szCs w:val="18"/>
         </w:rPr>
-        <w:t xml:space="preserve">System and file functions	16</w:t>
+        <w:t xml:space="preserve">System and file functions	17</w:t>
       </w:r>
     </w:p>
     <w:p>
@@ -975,7 +994,7 @@
           <w:sz w:val="19"/>
           <w:szCs w:val="19"/>
         </w:rPr>
-        <w:t xml:space="preserve">Chapter 8. Errors and Error Handling	17</w:t>
+        <w:t xml:space="preserve">Chapter 8. Errors and Error Handling	18</w:t>
       </w:r>
     </w:p>
     <w:p>
@@ -994,7 +1013,7 @@
           <w:sz w:val="18"/>
           <w:szCs w:val="18"/>
         </w:rPr>
-        <w:t xml:space="preserve">Runtime errors	17</w:t>
+        <w:t xml:space="preserve">Runtime errors	18</w:t>
       </w:r>
     </w:p>
     <w:p>
@@ -1013,7 +1032,7 @@
           <w:sz w:val="18"/>
           <w:szCs w:val="18"/>
         </w:rPr>
-        <w:t xml:space="preserve">ON ERROR	17</w:t>
+        <w:t xml:space="preserve">ON ERROR	18</w:t>
       </w:r>
     </w:p>
     <w:p>
@@ -1032,7 +1051,7 @@
           <w:sz w:val="19"/>
           <w:szCs w:val="19"/>
         </w:rPr>
-        <w:t xml:space="preserve">Chapter 9. How BASIC/CREXX Works	18</w:t>
+        <w:t xml:space="preserve">Chapter 9. How BASIC/CREXX Works	19</w:t>
       </w:r>
     </w:p>
     <w:p>
@@ -1051,7 +1070,7 @@
           <w:sz w:val="18"/>
           <w:szCs w:val="18"/>
         </w:rPr>
-        <w:t xml:space="preserve">Tokens	18</w:t>
+        <w:t xml:space="preserve">Tokens	19</w:t>
       </w:r>
     </w:p>
     <w:p>
@@ -1070,7 +1089,7 @@
           <w:sz w:val="18"/>
           <w:szCs w:val="18"/>
         </w:rPr>
-        <w:t xml:space="preserve">The link pass	18</w:t>
+        <w:t xml:space="preserve">The link pass	19</w:t>
       </w:r>
     </w:p>
     <w:p>
@@ -1089,7 +1108,7 @@
           <w:sz w:val="18"/>
           <w:szCs w:val="18"/>
         </w:rPr>
-        <w:t xml:space="preserve">Execution	18</w:t>
+        <w:t xml:space="preserve">Execution	19</w:t>
       </w:r>
     </w:p>
     <w:p>
@@ -1108,7 +1127,7 @@
           <w:sz w:val="18"/>
           <w:szCs w:val="18"/>
         </w:rPr>
-        <w:t xml:space="preserve">Performance	18</w:t>
+        <w:t xml:space="preserve">Performance	19</w:t>
       </w:r>
     </w:p>
     <w:p>
@@ -1127,7 +1146,7 @@
           <w:sz w:val="18"/>
           <w:szCs w:val="18"/>
         </w:rPr>
-        <w:t xml:space="preserve">Building	18</w:t>
+        <w:t xml:space="preserve">Building	19</w:t>
       </w:r>
     </w:p>
     <w:p>
@@ -1146,7 +1165,7 @@
           <w:sz w:val="19"/>
           <w:szCs w:val="19"/>
         </w:rPr>
-        <w:t xml:space="preserve">Chapter 10. Restrictions and Known Problems	19</w:t>
+        <w:t xml:space="preserve">Chapter 10. Restrictions and Known Problems	20</w:t>
       </w:r>
     </w:p>
     <w:p>
@@ -1165,7 +1184,7 @@
           <w:sz w:val="19"/>
           <w:szCs w:val="19"/>
         </w:rPr>
-        <w:t xml:space="preserve">Appendix A. Command Summary	20</w:t>
+        <w:t xml:space="preserve">Appendix A. Command Summary	21</w:t>
       </w:r>
     </w:p>
     <w:p>
@@ -1184,7 +1203,7 @@
           <w:sz w:val="18"/>
           <w:szCs w:val="18"/>
         </w:rPr>
-        <w:t xml:space="preserve">Command line	20</w:t>
+        <w:t xml:space="preserve">Command line	21</w:t>
       </w:r>
     </w:p>
     <w:p>
@@ -1203,7 +1222,7 @@
           <w:sz w:val="18"/>
           <w:szCs w:val="18"/>
         </w:rPr>
-        <w:t xml:space="preserve">Environment	20</w:t>
+        <w:t xml:space="preserve">Environment	21</w:t>
       </w:r>
     </w:p>
     <w:p>
@@ -1222,7 +1241,7 @@
           <w:sz w:val="18"/>
           <w:szCs w:val="18"/>
         </w:rPr>
-        <w:t xml:space="preserve">Return codes	20</w:t>
+        <w:t xml:space="preserve">Return codes	21</w:t>
       </w:r>
     </w:p>
     <w:p>
@@ -1241,7 +1260,7 @@
           <w:sz w:val="19"/>
           <w:szCs w:val="19"/>
         </w:rPr>
-        <w:t xml:space="preserve">Appendix B. Contents of the Repository	21</w:t>
+        <w:t xml:space="preserve">Appendix B. Contents of the Repository	22</w:t>
       </w:r>
     </w:p>
     <w:p>
@@ -1260,7 +1279,7 @@
           <w:sz w:val="19"/>
           <w:szCs w:val="19"/>
         </w:rPr>
-        <w:t xml:space="preserve">Appendix C. Differences between the Dialects	22</w:t>
+        <w:t xml:space="preserve">Appendix C. Differences between the Dialects	23</w:t>
       </w:r>
     </w:p>
     <w:p>
@@ -1279,7 +1298,7 @@
           <w:sz w:val="19"/>
           <w:szCs w:val="19"/>
         </w:rPr>
-        <w:t xml:space="preserve">Appendix D. Sample Programs	23</w:t>
+        <w:t xml:space="preserve">Appendix D. Sample Programs	24</w:t>
       </w:r>
     </w:p>
     <w:p>
@@ -3958,6 +3977,220 @@
           <w:sz w:val="24"/>
           <w:szCs w:val="24"/>
         </w:rPr>
+        <w:t xml:space="preserve">The C version</w:t>
+      </w:r>
+    </w:p>
+    <w:p>
+      <w:pPr>
+        <w:spacing w:after="120" w:line="264"/>
+      </w:pPr>
+      <w:r>
+        <w:rPr>
+          <w:rFonts w:ascii="Arial" w:cs="Arial" w:eastAsia="Arial" w:hAnsi="Arial"/>
+          <w:sz w:val="20"/>
+          <w:szCs w:val="20"/>
+        </w:rPr>
+        <w:t xml:space="preserve">The directory c holds a second implementation of the interpreter, a port to strict ISO C89 that needs no CREXX at all. It reads the same programs and prints the same output; the regression tests in the directory tests are shared by both versions. It is meant to run on small systems such as VM/370 under CMS, where a C compiler is available but CREXX is not.</w:t>
+      </w:r>
+    </w:p>
+    <w:p>
+      <w:pPr>
+        <w:keepNext/>
+        <w:keepLines/>
+        <w:pBdr>
+          <w:top w:val="single" w:color="808080" w:sz="4"/>
+          <w:left w:val="single" w:color="808080" w:sz="4"/>
+          <w:right w:val="single" w:color="808080" w:sz="4"/>
+        </w:pBdr>
+        <w:shd w:fill="F2F2F2" w:color="auto" w:val="clear"/>
+        <w:spacing w:after="0" w:line="240"/>
+        <w:ind w:left="100" w:right="100"/>
+      </w:pPr>
+      <w:r>
+        <w:rPr>
+          <w:rFonts w:ascii="Courier New" w:cs="Courier New" w:eastAsia="Courier New" w:hAnsi="Courier New"/>
+          <w:sz w:val="17"/>
+          <w:szCs w:val="17"/>
+        </w:rPr>
+        <w:t xml:space="preserve">cd c</w:t>
+      </w:r>
+    </w:p>
+    <w:p>
+      <w:pPr>
+        <w:keepNext/>
+        <w:keepLines/>
+        <w:pBdr>
+          <w:left w:val="single" w:color="808080" w:sz="4"/>
+          <w:right w:val="single" w:color="808080" w:sz="4"/>
+        </w:pBdr>
+        <w:shd w:fill="F2F2F2" w:color="auto" w:val="clear"/>
+        <w:spacing w:after="0" w:line="240"/>
+        <w:ind w:left="100" w:right="100"/>
+      </w:pPr>
+      <w:r>
+        <w:rPr>
+          <w:rFonts w:ascii="Courier New" w:cs="Courier New" w:eastAsia="Courier New" w:hAnsi="Courier New"/>
+          <w:sz w:val="17"/>
+          <w:szCs w:val="17"/>
+        </w:rPr>
+        <w:t xml:space="preserve">make                      # builds ./basic from the single file basic_all.c</w:t>
+      </w:r>
+    </w:p>
+    <w:p>
+      <w:pPr>
+        <w:keepNext/>
+        <w:keepLines/>
+        <w:pBdr>
+          <w:left w:val="single" w:color="808080" w:sz="4"/>
+          <w:right w:val="single" w:color="808080" w:sz="4"/>
+        </w:pBdr>
+        <w:shd w:fill="F2F2F2" w:color="auto" w:val="clear"/>
+        <w:spacing w:after="0" w:line="240"/>
+        <w:ind w:left="100" w:right="100"/>
+      </w:pPr>
+      <w:r>
+        <w:rPr>
+          <w:rFonts w:ascii="Courier New" w:cs="Courier New" w:eastAsia="Courier New" w:hAnsi="Courier New"/>
+          <w:sz w:val="17"/>
+          <w:szCs w:val="17"/>
+        </w:rPr>
+        <w:t xml:space="preserve">make test                 # runs ../tests against ./basic</w:t>
+      </w:r>
+    </w:p>
+    <w:p>
+      <w:pPr>
+        <w:keepNext/>
+        <w:keepLines/>
+        <w:pBdr>
+          <w:left w:val="single" w:color="808080" w:sz="4"/>
+          <w:right w:val="single" w:color="808080" w:sz="4"/>
+        </w:pBdr>
+        <w:shd w:fill="F2F2F2" w:color="auto" w:val="clear"/>
+        <w:spacing w:after="0" w:line="240"/>
+        <w:ind w:left="100" w:right="100"/>
+      </w:pPr>
+      <w:r>
+        <w:rPr>
+          <w:rFonts w:ascii="Courier New" w:cs="Courier New" w:eastAsia="Courier New" w:hAnsi="Courier New"/>
+          <w:sz w:val="17"/>
+          <w:szCs w:val="17"/>
+        </w:rPr>
+        <w:t xml:space="preserve">make strict               # gcc and clang -std=c89 -pedantic, sanitizers</w:t>
+      </w:r>
+    </w:p>
+    <w:p>
+      <w:pPr>
+        <w:keepNext/>
+        <w:keepLines/>
+        <w:pBdr>
+          <w:left w:val="single" w:color="808080" w:sz="4"/>
+          <w:right w:val="single" w:color="808080" w:sz="4"/>
+        </w:pBdr>
+        <w:shd w:fill="F2F2F2" w:color="auto" w:val="clear"/>
+        <w:spacing w:after="0" w:line="240"/>
+        <w:ind w:left="100" w:right="100"/>
+      </w:pPr>
+      <w:r>
+        <w:rPr>
+          <w:rFonts w:ascii="Courier New" w:cs="Courier New" w:eastAsia="Courier New" w:hAnsi="Courier New"/>
+          <w:sz w:val="17"/>
+          <w:szCs w:val="17"/>
+        </w:rPr>
+        <w:t xml:space="preserve">make deck                 # deck/basic_deck.c, lines of at most 71 columns</w:t>
+      </w:r>
+    </w:p>
+    <w:p>
+      <w:pPr>
+        <w:keepNext/>
+        <w:keepLines/>
+        <w:pBdr>
+          <w:left w:val="single" w:color="808080" w:sz="4"/>
+          <w:right w:val="single" w:color="808080" w:sz="4"/>
+        </w:pBdr>
+        <w:shd w:fill="F2F2F2" w:color="auto" w:val="clear"/>
+        <w:spacing w:after="0" w:line="240"/>
+        <w:ind w:left="100" w:right="100"/>
+      </w:pPr>
+      <w:r>
+        <w:rPr>
+          <w:rFonts w:ascii="Courier New" w:cs="Courier New" w:eastAsia="Courier New" w:hAnsi="Courier New"/>
+          <w:sz w:val="17"/>
+          <w:szCs w:val="17"/>
+        </w:rPr>
+        <w:t xml:space="preserve">./basic ../examples/hello.bas</w:t>
+      </w:r>
+    </w:p>
+    <w:p>
+      <w:pPr>
+        <w:keepNext w:val="false"/>
+        <w:keepLines/>
+        <w:pBdr>
+          <w:bottom w:val="single" w:color="808080" w:sz="4"/>
+          <w:left w:val="single" w:color="808080" w:sz="4"/>
+          <w:right w:val="single" w:color="808080" w:sz="4"/>
+        </w:pBdr>
+        <w:shd w:fill="F2F2F2" w:color="auto" w:val="clear"/>
+        <w:spacing w:after="0" w:line="240"/>
+        <w:ind w:left="100" w:right="100"/>
+      </w:pPr>
+      <w:r>
+        <w:rPr>
+          <w:rFonts w:ascii="Courier New" w:cs="Courier New" w:eastAsia="Courier New" w:hAnsi="Courier New"/>
+          <w:sz w:val="17"/>
+          <w:szCs w:val="17"/>
+        </w:rPr>
+        <w:t xml:space="preserve">./basic -fb prog.bas       # the options are the same as for the CREXX version</w:t>
+      </w:r>
+    </w:p>
+    <w:p>
+      <w:pPr>
+        <w:spacing w:after="200" w:before="60"/>
+      </w:pPr>
+      <w:r>
+        <w:rPr>
+          <w:rFonts w:ascii="Arial" w:cs="Arial" w:eastAsia="Arial" w:hAnsi="Arial"/>
+          <w:b/>
+          <w:bCs/>
+          <w:sz w:val="18"/>
+          <w:szCs w:val="18"/>
+        </w:rPr>
+        <w:t xml:space="preserve">Figure 4. </w:t>
+      </w:r>
+      <w:r>
+        <w:rPr>
+          <w:rFonts w:ascii="Arial" w:cs="Arial" w:eastAsia="Arial" w:hAnsi="Arial"/>
+          <w:sz w:val="18"/>
+          <w:szCs w:val="18"/>
+        </w:rPr>
+        <w:t xml:space="preserve">Building and running the C version</w:t>
+      </w:r>
+    </w:p>
+    <w:p>
+      <w:pPr>
+        <w:spacing w:after="120" w:line="264"/>
+      </w:pPr>
+      <w:r>
+        <w:rPr>
+          <w:rFonts w:ascii="Arial" w:cs="Arial" w:eastAsia="Arial" w:hAnsi="Arial"/>
+          <w:sz w:val="20"/>
+          <w:szCs w:val="20"/>
+        </w:rPr>
+        <w:t xml:space="preserve">The C version formats numbers exactly as the CREXX version does: a number is printed with up to 15 significant digits, whole numbers below 10 to the power 15 are printed in full, and the exponent form is used only for numbers of 10 to the power 18 or more and for numbers below 0.000001. The functions that work on bit patterns (AND, OR, XOR, NOT, EQV, IMP, SHL, SHR, HEX$, OCT$, BIN$) use 64-bit two-complement arithmetic that is built from 32-bit halves, so the results do not depend on the size of a long integer. Strings are strings of bytes: where the CREXX version counts UTF-8 characters (LEN, MID$, ASC and CHR$ for codes above 127), the C version counts bytes. The benchmark programs in the directory bench run under both versions and print the same results; bench/run_bench.sh times them.</w:t>
+      </w:r>
+    </w:p>
+    <w:p>
+      <w:pPr>
+        <w:pStyle w:val="Heading2"/>
+        <w:keepNext/>
+      </w:pPr>
+      <w:r>
+        <w:rPr>
+          <w:rFonts w:ascii="Arial" w:cs="Arial" w:eastAsia="Arial" w:hAnsi="Arial"/>
+          <w:b/>
+          <w:bCs/>
+          <w:sz w:val="24"/>
+          <w:szCs w:val="24"/>
+        </w:rPr>
         <w:t xml:space="preserve">Command-line options</w:t>
       </w:r>
     </w:p>
@@ -4425,7 +4658,7 @@
           <w:sz w:val="18"/>
           <w:szCs w:val="18"/>
         </w:rPr>
-        <w:t xml:space="preserve">Figure 4. </w:t>
+        <w:t xml:space="preserve">Figure 5. </w:t>
       </w:r>
       <w:r>
         <w:rPr>
@@ -4916,7 +5149,7 @@
           <w:sz w:val="18"/>
           <w:szCs w:val="18"/>
         </w:rPr>
-        <w:t xml:space="preserve">Figure 5. </w:t>
+        <w:t xml:space="preserve">Figure 6. </w:t>
       </w:r>
       <w:r>
         <w:rPr>
@@ -5277,7 +5510,7 @@
           <w:sz w:val="18"/>
           <w:szCs w:val="18"/>
         </w:rPr>
-        <w:t xml:space="preserve">Figure 6. </w:t>
+        <w:t xml:space="preserve">Figure 7. </w:t>
       </w:r>
       <w:r>
         <w:rPr>
@@ -5632,7 +5865,7 @@
           <w:sz w:val="18"/>
           <w:szCs w:val="18"/>
         </w:rPr>
-        <w:t xml:space="preserve">Figure 7. </w:t>
+        <w:t xml:space="preserve">Figure 8. </w:t>
       </w:r>
       <w:r>
         <w:rPr>
@@ -6215,7 +6448,7 @@
           <w:sz w:val="18"/>
           <w:szCs w:val="18"/>
         </w:rPr>
-        <w:t xml:space="preserve">Figure 8. </w:t>
+        <w:t xml:space="preserve">Figure 9. </w:t>
       </w:r>
       <w:r>
         <w:rPr>
@@ -7448,7 +7681,7 @@
           <w:sz w:val="18"/>
           <w:szCs w:val="18"/>
         </w:rPr>
-        <w:t xml:space="preserve">Figure 9. </w:t>
+        <w:t xml:space="preserve">Figure 10. </w:t>
       </w:r>
       <w:r>
         <w:rPr>
@@ -7633,7 +7866,7 @@
           <w:sz w:val="18"/>
           <w:szCs w:val="18"/>
         </w:rPr>
-        <w:t xml:space="preserve">Figure 10. </w:t>
+        <w:t xml:space="preserve">Figure 11. </w:t>
       </w:r>
       <w:r>
         <w:rPr>
@@ -8978,7 +9211,7 @@
           <w:sz w:val="18"/>
           <w:szCs w:val="18"/>
         </w:rPr>
-        <w:t xml:space="preserve">Figure 11. </w:t>
+        <w:t xml:space="preserve">Figure 12. </w:t>
       </w:r>
       <w:r>
         <w:rPr>
@@ -10664,7 +10897,7 @@
           <w:sz w:val="18"/>
           <w:szCs w:val="18"/>
         </w:rPr>
-        <w:t xml:space="preserve">Figure 12. </w:t>
+        <w:t xml:space="preserve">Figure 13. </w:t>
       </w:r>
       <w:r>
         <w:rPr>
@@ -11067,7 +11300,7 @@
           <w:sz w:val="18"/>
           <w:szCs w:val="18"/>
         </w:rPr>
-        <w:t xml:space="preserve">Figure 13. </w:t>
+        <w:t xml:space="preserve">Figure 14. </w:t>
       </w:r>
       <w:r>
         <w:rPr>
@@ -11535,7 +11768,7 @@
           <w:sz w:val="18"/>
           <w:szCs w:val="18"/>
         </w:rPr>
-        <w:t xml:space="preserve">Figure 14. </w:t>
+        <w:t xml:space="preserve">Figure 15. </w:t>
       </w:r>
       <w:r>
         <w:rPr>
@@ -12543,7 +12776,7 @@
           <w:sz w:val="18"/>
           <w:szCs w:val="18"/>
         </w:rPr>
-        <w:t xml:space="preserve">Figure 15. </w:t>
+        <w:t xml:space="preserve">Figure 16. </w:t>
       </w:r>
       <w:r>
         <w:rPr>
@@ -12764,7 +12997,7 @@
           <w:sz w:val="18"/>
           <w:szCs w:val="18"/>
         </w:rPr>
-        <w:t xml:space="preserve">Figure 16. </w:t>
+        <w:t xml:space="preserve">Figure 17. </w:t>
       </w:r>
       <w:r>
         <w:rPr>
@@ -13180,7 +13413,7 @@
           <w:sz w:val="18"/>
           <w:szCs w:val="18"/>
         </w:rPr>
-        <w:t xml:space="preserve">Figure 17. </w:t>
+        <w:t xml:space="preserve">Figure 18. </w:t>
       </w:r>
       <w:r>
         <w:rPr>
@@ -13376,7 +13609,7 @@
           <w:sz w:val="18"/>
           <w:szCs w:val="18"/>
         </w:rPr>
-        <w:t xml:space="preserve">Figure 18. </w:t>
+        <w:t xml:space="preserve">Figure 19. </w:t>
       </w:r>
       <w:r>
         <w:rPr>
@@ -13731,7 +13964,7 @@
           <w:sz w:val="18"/>
           <w:szCs w:val="18"/>
         </w:rPr>
-        <w:t xml:space="preserve">Figure 19. </w:t>
+        <w:t xml:space="preserve">Figure 20. </w:t>
       </w:r>
       <w:r>
         <w:rPr>
@@ -14738,7 +14971,7 @@
           <w:sz w:val="18"/>
           <w:szCs w:val="18"/>
         </w:rPr>
-        <w:t xml:space="preserve">Figure 20. </w:t>
+        <w:t xml:space="preserve">Figure 21. </w:t>
       </w:r>
       <w:r>
         <w:rPr>
@@ -14839,7 +15072,7 @@
           <w:sz w:val="18"/>
           <w:szCs w:val="18"/>
         </w:rPr>
-        <w:t xml:space="preserve">Figure 21. </w:t>
+        <w:t xml:space="preserve">Figure 22. </w:t>
       </w:r>
       <w:r>
         <w:rPr>
@@ -15053,7 +15286,7 @@
           <w:sz w:val="18"/>
           <w:szCs w:val="18"/>
         </w:rPr>
-        <w:t xml:space="preserve">Figure 22. </w:t>
+        <w:t xml:space="preserve">Figure 23. </w:t>
       </w:r>
       <w:r>
         <w:rPr>
@@ -15170,7 +15403,7 @@
           <w:sz w:val="18"/>
           <w:szCs w:val="18"/>
         </w:rPr>
-        <w:t xml:space="preserve">Figure 23. </w:t>
+        <w:t xml:space="preserve">Figure 24. </w:t>
       </w:r>
       <w:r>
         <w:rPr>
@@ -15599,7 +15832,7 @@
           <w:sz w:val="18"/>
           <w:szCs w:val="18"/>
         </w:rPr>
-        <w:t xml:space="preserve">Figure 24. </w:t>
+        <w:t xml:space="preserve">Figure 25. </w:t>
       </w:r>
       <w:r>
         <w:rPr>
@@ -17469,7 +17702,7 @@
           <w:sz w:val="18"/>
           <w:szCs w:val="18"/>
         </w:rPr>
-        <w:t xml:space="preserve">Figure 25. </w:t>
+        <w:t xml:space="preserve">Figure 26. </w:t>
       </w:r>
       <w:r>
         <w:rPr>
@@ -18717,7 +18950,7 @@
           <w:sz w:val="18"/>
           <w:szCs w:val="18"/>
         </w:rPr>
-        <w:t xml:space="preserve">Figure 26. </w:t>
+        <w:t xml:space="preserve">Figure 27. </w:t>
       </w:r>
       <w:r>
         <w:rPr>
@@ -19685,7 +19918,7 @@
           <w:sz w:val="18"/>
           <w:szCs w:val="18"/>
         </w:rPr>
-        <w:t xml:space="preserve">Figure 27. </w:t>
+        <w:t xml:space="preserve">Figure 28. </w:t>
       </w:r>
       <w:r>
         <w:rPr>
@@ -21716,7 +21949,7 @@
           <w:sz w:val="18"/>
           <w:szCs w:val="18"/>
         </w:rPr>
-        <w:t xml:space="preserve">Figure 28. </w:t>
+        <w:t xml:space="preserve">Figure 29. </w:t>
       </w:r>
       <w:r>
         <w:rPr>
@@ -21904,7 +22137,7 @@
           <w:sz w:val="18"/>
           <w:szCs w:val="18"/>
         </w:rPr>
-        <w:t xml:space="preserve">Figure 29. </w:t>
+        <w:t xml:space="preserve">Figure 30. </w:t>
       </w:r>
       <w:r>
         <w:rPr>
@@ -22089,7 +22322,7 @@
           <w:sz w:val="18"/>
           <w:szCs w:val="18"/>
         </w:rPr>
-        <w:t xml:space="preserve">Figure 30. </w:t>
+        <w:t xml:space="preserve">Figure 31. </w:t>
       </w:r>
       <w:r>
         <w:rPr>
@@ -22794,7 +23027,7 @@
           <w:sz w:val="18"/>
           <w:szCs w:val="18"/>
         </w:rPr>
-        <w:t xml:space="preserve">Figure 31. </w:t>
+        <w:t xml:space="preserve">Figure 32. </w:t>
       </w:r>
       <w:r>
         <w:rPr>
@@ -23289,6 +23522,34 @@
           <w:szCs w:val="20"/>
         </w:rPr>
         <w:t xml:space="preserve"> The interpreter is itself interpreted by the CREXX virtual machine; programs run about 100 to 1000 times more slowly than under a compiled BASIC.</w:t>
+      </w:r>
+    </w:p>
+    <w:p>
+      <w:pPr>
+        <w:pStyle w:val="ListParagraph"/>
+        <w:numPr>
+          <w:ilvl w:val="0"/>
+          <w:numId w:val="2"/>
+        </w:numPr>
+        <w:spacing w:after="80"/>
+      </w:pPr>
+      <w:r>
+        <w:rPr>
+          <w:rFonts w:ascii="Arial" w:cs="Arial" w:eastAsia="Arial" w:hAnsi="Arial"/>
+          <w:b/>
+          <w:bCs/>
+          <w:sz w:val="20"/>
+          <w:szCs w:val="20"/>
+        </w:rPr>
+        <w:t xml:space="preserve">The C version.</w:t>
+      </w:r>
+      <w:r>
+        <w:rPr>
+          <w:rFonts w:ascii="Arial" w:cs="Arial" w:eastAsia="Arial" w:hAnsi="Arial"/>
+          <w:sz w:val="20"/>
+          <w:szCs w:val="20"/>
+        </w:rPr>
+        <w:t xml:space="preserve"> It differs from the CREXX version only for text outside the 7-bit character set (it works on bytes, CHR$ above 255 gives the low byte) and for hexadecimal literals of more than 15 digits.</w:t>
       </w:r>
     </w:p>
     <w:p>
@@ -23453,7 +23714,7 @@
           <w:sz w:val="18"/>
           <w:szCs w:val="18"/>
         </w:rPr>
-        <w:t xml:space="preserve">Figure 32. </w:t>
+        <w:t xml:space="preserve">Figure 33. </w:t>
       </w:r>
       <w:r>
         <w:rPr>
@@ -23651,7 +23912,7 @@
           <w:sz w:val="18"/>
           <w:szCs w:val="18"/>
         </w:rPr>
-        <w:t xml:space="preserve">Figure 33. </w:t>
+        <w:t xml:space="preserve">Figure 34. </w:t>
       </w:r>
       <w:r>
         <w:rPr>
@@ -23989,7 +24250,7 @@
           <w:sz w:val="18"/>
           <w:szCs w:val="18"/>
         </w:rPr>
-        <w:t xml:space="preserve">Figure 34. </w:t>
+        <w:t xml:space="preserve">Figure 35. </w:t>
       </w:r>
       <w:r>
         <w:rPr>
@@ -24491,7 +24752,7 @@
                 <w:sz w:val="17"/>
                 <w:szCs w:val="17"/>
               </w:rPr>
-              <w:t xml:space="preserve">tests/run_tests.sh</w:t>
+              <w:t xml:space="preserve">c/</w:t>
             </w:r>
           </w:p>
         </w:tc>
@@ -24523,7 +24784,7 @@
                 <w:sz w:val="17"/>
                 <w:szCs w:val="17"/>
               </w:rPr>
-              <w:t xml:space="preserve">the regression test driver</w:t>
+              <w:t xml:space="preserve">the C89 port: src/ (the parts), basic_all.c (the amalgamated single source), Makefile, tools/, tests/run_tests.sh, deck/basic_deck.c (71-column card deck)</w:t>
             </w:r>
           </w:p>
         </w:tc>
@@ -24561,7 +24822,7 @@
                 <w:sz w:val="17"/>
                 <w:szCs w:val="17"/>
               </w:rPr>
-              <w:t xml:space="preserve">tests/*.bas, *.out, *.in, *.flags</w:t>
+              <w:t xml:space="preserve">bench/</w:t>
             </w:r>
           </w:p>
         </w:tc>
@@ -24593,7 +24854,7 @@
                 <w:sz w:val="17"/>
                 <w:szCs w:val="17"/>
               </w:rPr>
-              <w:t xml:space="preserve">test programs with their expected output, standard input and options</w:t>
+              <w:t xml:space="preserve">benchmark programs for both versions and bench/run_bench.sh</w:t>
             </w:r>
           </w:p>
         </w:tc>
@@ -24631,6 +24892,146 @@
                 <w:sz w:val="17"/>
                 <w:szCs w:val="17"/>
               </w:rPr>
+              <w:t xml:space="preserve">tests/run_tests.sh</w:t>
+            </w:r>
+          </w:p>
+        </w:tc>
+        <w:tc>
+          <w:tcPr>
+            <w:tcW w:type="dxa" w:w="6038"/>
+            <w:tcBorders>
+              <w:top w:val="single" w:color="808080" w:sz="4"/>
+              <w:left w:val="single" w:color="808080" w:sz="4"/>
+              <w:bottom w:val="single" w:color="808080" w:sz="4"/>
+              <w:right w:val="single" w:color="808080" w:sz="4"/>
+            </w:tcBorders>
+            <w:tcMar>
+              <w:top w:type="dxa" w:w="50"/>
+              <w:left w:type="dxa" w:w="90"/>
+              <w:bottom w:type="dxa" w:w="50"/>
+              <w:right w:type="dxa" w:w="90"/>
+            </w:tcMar>
+          </w:tcPr>
+          <w:p>
+            <w:pPr>
+              <w:spacing w:after="0"/>
+            </w:pPr>
+            <w:r>
+              <w:rPr>
+                <w:rFonts w:ascii="Arial" w:cs="Arial" w:eastAsia="Arial" w:hAnsi="Arial"/>
+                <w:b w:val="false"/>
+                <w:bCs w:val="false"/>
+                <w:sz w:val="17"/>
+                <w:szCs w:val="17"/>
+              </w:rPr>
+              <w:t xml:space="preserve">the regression test driver</w:t>
+            </w:r>
+          </w:p>
+        </w:tc>
+      </w:tr>
+      <w:tr>
+        <w:trPr>
+          <w:cantSplit/>
+          <w:tblHeader w:val="false"/>
+        </w:trPr>
+        <w:tc>
+          <w:tcPr>
+            <w:tcW w:type="dxa" w:w="3600"/>
+            <w:tcBorders>
+              <w:top w:val="single" w:color="808080" w:sz="4"/>
+              <w:left w:val="single" w:color="808080" w:sz="4"/>
+              <w:bottom w:val="single" w:color="808080" w:sz="4"/>
+              <w:right w:val="single" w:color="808080" w:sz="4"/>
+            </w:tcBorders>
+            <w:tcMar>
+              <w:top w:type="dxa" w:w="50"/>
+              <w:left w:type="dxa" w:w="90"/>
+              <w:bottom w:type="dxa" w:w="50"/>
+              <w:right w:type="dxa" w:w="90"/>
+            </w:tcMar>
+          </w:tcPr>
+          <w:p>
+            <w:pPr>
+              <w:spacing w:after="0"/>
+            </w:pPr>
+            <w:r>
+              <w:rPr>
+                <w:rFonts w:ascii="Arial" w:cs="Arial" w:eastAsia="Arial" w:hAnsi="Arial"/>
+                <w:b w:val="false"/>
+                <w:bCs w:val="false"/>
+                <w:sz w:val="17"/>
+                <w:szCs w:val="17"/>
+              </w:rPr>
+              <w:t xml:space="preserve">tests/*.bas, *.out, *.in, *.flags</w:t>
+            </w:r>
+          </w:p>
+        </w:tc>
+        <w:tc>
+          <w:tcPr>
+            <w:tcW w:type="dxa" w:w="6038"/>
+            <w:tcBorders>
+              <w:top w:val="single" w:color="808080" w:sz="4"/>
+              <w:left w:val="single" w:color="808080" w:sz="4"/>
+              <w:bottom w:val="single" w:color="808080" w:sz="4"/>
+              <w:right w:val="single" w:color="808080" w:sz="4"/>
+            </w:tcBorders>
+            <w:tcMar>
+              <w:top w:type="dxa" w:w="50"/>
+              <w:left w:type="dxa" w:w="90"/>
+              <w:bottom w:type="dxa" w:w="50"/>
+              <w:right w:type="dxa" w:w="90"/>
+            </w:tcMar>
+          </w:tcPr>
+          <w:p>
+            <w:pPr>
+              <w:spacing w:after="0"/>
+            </w:pPr>
+            <w:r>
+              <w:rPr>
+                <w:rFonts w:ascii="Arial" w:cs="Arial" w:eastAsia="Arial" w:hAnsi="Arial"/>
+                <w:b w:val="false"/>
+                <w:bCs w:val="false"/>
+                <w:sz w:val="17"/>
+                <w:szCs w:val="17"/>
+              </w:rPr>
+              <w:t xml:space="preserve">test programs with their expected output, standard input and options</w:t>
+            </w:r>
+          </w:p>
+        </w:tc>
+      </w:tr>
+      <w:tr>
+        <w:trPr>
+          <w:cantSplit/>
+          <w:tblHeader w:val="false"/>
+        </w:trPr>
+        <w:tc>
+          <w:tcPr>
+            <w:tcW w:type="dxa" w:w="3600"/>
+            <w:tcBorders>
+              <w:top w:val="single" w:color="808080" w:sz="4"/>
+              <w:left w:val="single" w:color="808080" w:sz="4"/>
+              <w:bottom w:val="single" w:color="808080" w:sz="4"/>
+              <w:right w:val="single" w:color="808080" w:sz="4"/>
+            </w:tcBorders>
+            <w:tcMar>
+              <w:top w:type="dxa" w:w="50"/>
+              <w:left w:type="dxa" w:w="90"/>
+              <w:bottom w:type="dxa" w:w="50"/>
+              <w:right w:type="dxa" w:w="90"/>
+            </w:tcMar>
+          </w:tcPr>
+          <w:p>
+            <w:pPr>
+              <w:spacing w:after="0"/>
+            </w:pPr>
+            <w:r>
+              <w:rPr>
+                <w:rFonts w:ascii="Arial" w:cs="Arial" w:eastAsia="Arial" w:hAnsi="Arial"/>
+                <w:b w:val="false"/>
+                <w:bCs w:val="false"/>
+                <w:sz w:val="17"/>
+                <w:szCs w:val="17"/>
+              </w:rPr>
               <w:t xml:space="preserve">.gitignore</w:t>
             </w:r>
           </w:p>
@@ -24681,7 +25082,7 @@
           <w:sz w:val="18"/>
           <w:szCs w:val="18"/>
         </w:rPr>
-        <w:t xml:space="preserve">Figure 35. </w:t>
+        <w:t xml:space="preserve">Figure 36. </w:t>
       </w:r>
       <w:r>
         <w:rPr>
@@ -26636,7 +27037,7 @@
           <w:sz w:val="18"/>
           <w:szCs w:val="18"/>
         </w:rPr>
-        <w:t xml:space="preserve">Figure 36. </w:t>
+        <w:t xml:space="preserve">Figure 37. </w:t>
       </w:r>
       <w:r>
         <w:rPr>
@@ -27733,7 +28134,7 @@
           <w:sz w:val="18"/>
           <w:szCs w:val="18"/>
         </w:rPr>
-        <w:t xml:space="preserve">Figure 37. </w:t>
+        <w:t xml:space="preserve">Figure 38. </w:t>
       </w:r>
       <w:r>
         <w:rPr>

</xml_diff>